<commit_message>
Update final network configuration and Phase 1 evidence
Co-authored-by: Cursor <cursoragent@cursor.com>
</commit_message>
<xml_diff>
--- a/docs/Team1_Computer_Networks_Project_Report.docx
+++ b/docs/Team1_Computer_Networks_Project_Report.docx
@@ -485,7 +485,7 @@
               <w:rPr>
                 <w:sz w:val="16"/>
               </w:rPr>
-              <w:t>10.7.18.35</w:t>
+              <w:t>10.7.26.232</w:t>
             </w:r>
           </w:p>
         </w:tc>
@@ -591,7 +591,7 @@
               <w:rPr>
                 <w:sz w:val="16"/>
               </w:rPr>
-              <w:t>10.7.4.38</w:t>
+              <w:t>10.7.22.54</w:t>
             </w:r>
           </w:p>
         </w:tc>
@@ -717,7 +717,7 @@
         <w:t xml:space="preserve">DNS resolution: </w:t>
       </w:r>
       <w:r>
-        <w:t>The client asks Mac 1 (10.7.17.154) for app.team1.test. dnsmasq returns Mac 2's IP, 10.7.18.35, with TTL 60 seconds.</w:t>
+        <w:t>The client asks Mac 1 (10.7.17.154) for app.team1.test. dnsmasq returns Mac 2's IP, 10.7.26.232, with TTL 60 seconds.</w:t>
       </w:r>
     </w:p>
     <w:p>
@@ -801,7 +801,7 @@
         <w:pStyle w:val="ListBullet"/>
       </w:pPr>
       <w:r>
-        <w:t>app.team1.test -&gt; 10.7.18.35</w:t>
+        <w:t>app.team1.test -&gt; 10.7.26.232</w:t>
       </w:r>
     </w:p>
     <w:p>
@@ -809,7 +809,7 @@
         <w:pStyle w:val="ListBullet"/>
       </w:pPr>
       <w:r>
-        <w:t>api.team1.test -&gt; 10.7.18.35</w:t>
+        <w:t>api.team1.test -&gt; 10.7.26.232</w:t>
       </w:r>
     </w:p>
     <w:p>
@@ -838,7 +838,7 @@
     </w:p>
     <w:p>
       <w:r>
-        <w:t>Backend A runs on Mac 3 at 10.7.4.38:3001. Backend B runs on Mac 1 at 10.7.17.154:3002. Both expose:</w:t>
+        <w:t>Backend A runs on Mac 3 at 10.7.22.54:3001. Backend B runs on Mac 1 at 10.7.17.154:3002. Both expose:</w:t>
       </w:r>
     </w:p>
     <w:p>
@@ -988,7 +988,7 @@
               <w:rPr>
                 <w:sz w:val="17"/>
               </w:rPr>
-              <w:t>dig app.team1.test returned 10.7.18.35 with TTL 60 using DNS server 10.7.17.154.</w:t>
+              <w:t>dig app.team1.test returned 10.7.26.232 with TTL 60 using DNS server 10.7.17.154.</w:t>
             </w:r>
           </w:p>
         </w:tc>
@@ -1111,7 +1111,7 @@
               <w:rPr>
                 <w:sz w:val="17"/>
               </w:rPr>
-              <w:t>Eight consecutive requests returned B, A, B, A, B, A, B, A.</w:t>
+              <w:t>Six consecutive requests returned A, B, A, B, A, B. The terminal output was not saved.</w:t>
             </w:r>
           </w:p>
         </w:tc>
@@ -1384,7 +1384,7 @@
         <w:t xml:space="preserve">DNS: </w:t>
       </w:r>
       <w:r>
-        <w:t>Filter: dns.qry.name contains "team1". The capture shows Mac 3 querying Mac 1 and receiving app.team1.test = 10.7.18.35.</w:t>
+        <w:t>Filter: dns.qry.name contains "team1". The capture shows Mac 3 querying Mac 1 and receiving app.team1.test = 10.7.18.35, the capture-time DHCP address of the edge.</w:t>
       </w:r>
     </w:p>
     <w:p>
@@ -1439,7 +1439,7 @@
         <w:t xml:space="preserve">Encrypted application data: </w:t>
       </w:r>
       <w:r>
-        <w:t>TLS Application Data packets are visible between Mac 3 (10.7.4.38) and Mac 2 (10.7.18.35), demonstrating that HTTP content is encrypted on the client-to-edge link.</w:t>
+        <w:t>TLS Application Data packets are visible between Mac 3 (10.7.4.38) and Mac 2 (10.7.18.35), the capture-time DHCP addresses, demonstrating that HTTP content is encrypted on the client-to-edge link.</w:t>
       </w:r>
     </w:p>
     <w:p>
@@ -1594,7 +1594,7 @@
     </w:p>
     <w:p>
       <w:r>
-        <w:t>After all controlled failure tests, the configuration was restored to the normal operating state: app.team1.test resolves to 10.7.18.35 through Mac 1 (10.7.17.154), nginx is the HTTPS edge on Mac 2, and both Backend A and Backend B are available for round-robin traffic.</w:t>
+        <w:t>After all controlled failure tests, the configuration was restored to the normal operating state: app.team1.test resolves to 10.7.26.232 through Mac 1 (10.7.17.154), nginx is the HTTPS edge on Mac 2, and both Backend A and Backend B are available for round-robin traffic.</w:t>
       </w:r>
     </w:p>
     <w:p>
@@ -1612,7 +1612,7 @@
     </w:p>
     <w:p>
       <w:r>
-        <w:t>☐ DNS query and response showing 10.7.18.35 and TTL 60</w:t>
+        <w:t>☐ DNS query and response showing capture-time address 10.7.18.35 and TTL 60</w:t>
       </w:r>
     </w:p>
     <w:p>

</xml_diff>